<commit_message>
finish yazdnegar 5 now template work corectly
</commit_message>
<xml_diff>
--- a/YazdNegar/Templates/YazdUniversity/1_PersianIdentity_SchoolResearch.docx
+++ b/YazdNegar/Templates/YazdUniversity/1_PersianIdentity_SchoolResearch.docx
@@ -1,6 +1,6 @@
 
 <file path=word/document.xml><?xml version="1.0" encoding="utf-8"?>
-<w:document xmlns:wpc="http://schemas.microsoft.com/office/word/2010/wordprocessingCanvas" xmlns:cx="http://schemas.microsoft.com/office/drawing/2014/chartex" xmlns:cx1="http://schemas.microsoft.com/office/drawing/2015/9/8/chartex" xmlns:cx2="http://schemas.microsoft.com/office/drawing/2015/10/21/chartex" xmlns:cx3="http://schemas.microsoft.com/office/drawing/2016/5/9/chartex" xmlns:cx4="http://schemas.microsoft.com/office/drawing/2016/5/10/chartex" xmlns:cx5="http://schemas.microsoft.com/office/drawing/2016/5/11/chartex" xmlns:cx6="http://schemas.microsoft.com/office/drawing/2016/5/12/chartex" xmlns:cx7="http://schemas.microsoft.com/office/drawing/2016/5/13/chartex" xmlns:cx8="http://schemas.microsoft.com/office/drawing/2016/5/14/chartex" xmlns:mc="http://schemas.openxmlformats.org/markup-compatibility/2006" xmlns:aink="http://schemas.microsoft.com/office/drawing/2016/ink" xmlns:am3d="http://schemas.microsoft.com/office/drawing/2017/model3d" xmlns:o="urn:schemas-microsoft-com:office:office" xmlns:oel="http://schemas.microsoft.com/office/2019/extlst" xmlns:r="http://schemas.openxmlformats.org/officeDocument/2006/relationships" xmlns:m="http://schemas.openxmlformats.org/officeDocument/2006/math" xmlns:v="urn:schemas-microsoft-com:vml" xmlns:wp14="http://schemas.microsoft.com/office/word/2010/wordprocessingDrawing" xmlns:wp="http://schemas.openxmlformats.org/drawingml/2006/wordprocessingDrawing" xmlns:w10="urn:schemas-microsoft-com:office:word" xmlns:w="http://schemas.openxmlformats.org/wordprocessingml/2006/main" xmlns:w14="http://schemas.microsoft.com/office/word/2010/wordml" xmlns:w15="http://schemas.microsoft.com/office/word/2012/wordml" xmlns:w16cex="http://schemas.microsoft.com/office/word/2018/wordml/cex" xmlns:w16cid="http://schemas.microsoft.com/office/word/2016/wordml/cid" xmlns:w16="http://schemas.microsoft.com/office/word/2018/wordml" xmlns:w16du="http://schemas.microsoft.com/office/word/2023/wordml/word16du" xmlns:w16sdtdh="http://schemas.microsoft.com/office/word/2020/wordml/sdtdatahash" xmlns:w16sdtfl="http://schemas.microsoft.com/office/word/2024/wordml/sdtformatlock" xmlns:w16se="http://schemas.microsoft.com/office/word/2015/wordml/symex" xmlns:wpg="http://schemas.microsoft.com/office/word/2010/wordprocessingGroup" xmlns:wpi="http://schemas.microsoft.com/office/word/2010/wordprocessingInk" xmlns:wne="http://schemas.microsoft.com/office/word/2006/wordml" xmlns:wps="http://schemas.microsoft.com/office/word/2010/wordprocessingShape" mc:Ignorable="w14 w15 w16se w16cid w16 w16cex w16sdtdh w16sdtfl w16du wp14">
+<w:document xmlns:wpc="http://schemas.microsoft.com/office/word/2010/wordprocessingCanvas" xmlns:cx="http://schemas.microsoft.com/office/drawing/2014/chartex" xmlns:cx1="http://schemas.microsoft.com/office/drawing/2015/9/8/chartex" xmlns:cx2="http://schemas.microsoft.com/office/drawing/2015/10/21/chartex" xmlns:cx3="http://schemas.microsoft.com/office/drawing/2016/5/9/chartex" xmlns:cx4="http://schemas.microsoft.com/office/drawing/2016/5/10/chartex" xmlns:cx5="http://schemas.microsoft.com/office/drawing/2016/5/11/chartex" xmlns:cx6="http://schemas.microsoft.com/office/drawing/2016/5/12/chartex" xmlns:cx7="http://schemas.microsoft.com/office/drawing/2016/5/13/chartex" xmlns:cx8="http://schemas.microsoft.com/office/drawing/2016/5/14/chartex" xmlns:mc="http://schemas.openxmlformats.org/markup-compatibility/2006" xmlns:aink="http://schemas.microsoft.com/office/drawing/2016/ink" xmlns:am3d="http://schemas.microsoft.com/office/drawing/2017/model3d" xmlns:o="urn:schemas-microsoft-com:office:office" xmlns:oel="http://schemas.microsoft.com/office/2019/extlst" xmlns:r="http://schemas.openxmlformats.org/officeDocument/2006/relationships" xmlns:m="http://schemas.openxmlformats.org/officeDocument/2006/math" xmlns:v="urn:schemas-microsoft-com:vml" xmlns:wp14="http://schemas.microsoft.com/office/word/2010/wordprocessingDrawing" xmlns:wp="http://schemas.openxmlformats.org/drawingml/2006/wordprocessingDrawing" xmlns:w10="urn:schemas-microsoft-com:office:word" xmlns:w="http://schemas.openxmlformats.org/wordprocessingml/2006/main" xmlns:w14="http://schemas.microsoft.com/office/word/2010/wordml" xmlns:w15="http://schemas.microsoft.com/office/word/2012/wordml" xmlns:w16cex="http://schemas.microsoft.com/office/word/2018/wordml/cex" xmlns:w16cid="http://schemas.microsoft.com/office/word/2016/wordml/cid" xmlns:w16="http://schemas.microsoft.com/office/word/2018/wordml" xmlns:w16sdtdh="http://schemas.microsoft.com/office/word/2020/wordml/sdtdatahash" xmlns:w16se="http://schemas.microsoft.com/office/word/2015/wordml/symex" xmlns:wpg="http://schemas.microsoft.com/office/word/2010/wordprocessingGroup" xmlns:wpi="http://schemas.microsoft.com/office/word/2010/wordprocessingInk" xmlns:wne="http://schemas.microsoft.com/office/word/2006/wordml" xmlns:wps="http://schemas.microsoft.com/office/word/2010/wordprocessingShape" mc:Ignorable="w14 w15 w16se w16cid w16 w16cex w16sdtdh wp14">
   <w:body>
     <w:sdt>
       <w:sdtPr>
@@ -13,7 +13,6 @@
         <w:id w:val="1668127111"/>
         <w:picture/>
       </w:sdtPr>
-      <w:sdtEndPr/>
       <w:sdtContent>
         <w:p>
           <w:pPr>
@@ -137,7 +136,6 @@
           <w:docPart w:val="304F6560D06E4BCC95A55388F0C231DF"/>
         </w:placeholder>
       </w:sdtPr>
-      <w:sdtEndPr/>
       <w:sdtContent>
         <w:p>
           <w:pPr>
@@ -181,7 +179,6 @@
           <w:docPart w:val="88F10C87D46C4922AD4CCEAC3F6D6F81"/>
         </w:placeholder>
       </w:sdtPr>
-      <w:sdtEndPr/>
       <w:sdtContent>
         <w:p>
           <w:pPr>
@@ -261,7 +258,6 @@
             <w:docPart w:val="B030A7FFCCDD44DDBDCB5A4CF651FFEF"/>
           </w:placeholder>
         </w:sdtPr>
-        <w:sdtEndPr/>
         <w:sdtContent>
           <w:r>
             <w:rPr>
@@ -485,7 +481,6 @@
           <w:docPart w:val="E5E81096CC534918A8D2639210543913"/>
         </w:placeholder>
       </w:sdtPr>
-      <w:sdtEndPr/>
       <w:sdtContent>
         <w:p>
           <w:pPr>
@@ -520,53 +515,21 @@
         <w:contextualSpacing/>
         <w:jc w:val="center"/>
         <w:rPr>
+          <w:sz w:val="44"/>
+          <w:szCs w:val="44"/>
           <w:rtl/>
         </w:rPr>
       </w:pPr>
-    </w:p>
-    <w:sdt>
-      <w:sdtPr>
+      <w:r>
         <w:rPr>
-          <w:b/>
-          <w:bCs/>
-          <w:sz w:val="30"/>
-          <w:szCs w:val="30"/>
+          <w:rFonts w:hint="cs"/>
+          <w:sz w:val="44"/>
+          <w:szCs w:val="44"/>
           <w:rtl/>
         </w:rPr>
-        <w:tag w:val="_field_Supervisor_Title_Fa"/>
-        <w:id w:val="682173524"/>
-        <w:placeholder>
-          <w:docPart w:val="7C427412CF1D4B40B38824F7B7FF974F"/>
-        </w:placeholder>
-      </w:sdtPr>
-      <w:sdtEndPr/>
-      <w:sdtContent>
-        <w:p>
-          <w:pPr>
-            <w:spacing w:after="0" w:afterAutospacing="0" w:line="264" w:lineRule="auto"/>
-            <w:contextualSpacing/>
-            <w:jc w:val="center"/>
-            <w:rPr>
-              <w:b/>
-              <w:bCs/>
-              <w:sz w:val="30"/>
-              <w:szCs w:val="30"/>
-              <w:rtl/>
-            </w:rPr>
-          </w:pPr>
-          <w:r>
-            <w:rPr>
-              <w:b/>
-              <w:bCs/>
-              <w:sz w:val="30"/>
-              <w:szCs w:val="30"/>
-              <w:rtl/>
-            </w:rPr>
-            <w:t>استاد درس:</w:t>
-          </w:r>
-        </w:p>
-      </w:sdtContent>
-    </w:sdt>
+        <w:t>استاد درس</w:t>
+      </w:r>
+    </w:p>
     <w:sdt>
       <w:sdtPr>
         <w:rPr>
@@ -580,7 +543,6 @@
           <w:docPart w:val="3D4DC6A50309446F9D5EAD0AEDB70D0B"/>
         </w:placeholder>
       </w:sdtPr>
-      <w:sdtEndPr/>
       <w:sdtContent>
         <w:p>
           <w:pPr>
@@ -600,7 +562,7 @@
               <w:szCs w:val="26"/>
               <w:rtl/>
             </w:rPr>
-            <w:t>استاد درس</w:t>
+            <w:t>استاد(ان) راهنما</w:t>
           </w:r>
         </w:p>
       </w:sdtContent>
@@ -621,7 +583,6 @@
       <w:pPr>
         <w:spacing w:after="0" w:afterAutospacing="0" w:line="264" w:lineRule="auto"/>
         <w:contextualSpacing/>
-        <w:jc w:val="center"/>
         <w:rPr>
           <w:b/>
           <w:bCs/>
@@ -644,7 +605,6 @@
           <w:docPart w:val="222FA21C36034CD3A0A7A0A8AA047BB8"/>
         </w:placeholder>
       </w:sdtPr>
-      <w:sdtEndPr/>
       <w:sdtContent>
         <w:p>
           <w:pPr>
@@ -740,7 +700,6 @@
           <w:docPart w:val="3D9899DAED494D7484C764AAA17C1A87"/>
         </w:placeholder>
       </w:sdtPr>
-      <w:sdtEndPr/>
       <w:sdtContent>
         <w:p>
           <w:pPr>
@@ -762,7 +721,7 @@
               <w:szCs w:val="26"/>
               <w:rtl/>
             </w:rPr>
-            <w:t>تاریخ ارائه</w:t>
+            <w:t>تاریخ دفاع</w:t>
           </w:r>
         </w:p>
       </w:sdtContent>
@@ -791,7 +750,7 @@
 </file>
 
 <file path=word/endnotes.xml><?xml version="1.0" encoding="utf-8"?>
-<w:endnotes xmlns:wpc="http://schemas.microsoft.com/office/word/2010/wordprocessingCanvas" xmlns:cx="http://schemas.microsoft.com/office/drawing/2014/chartex" xmlns:cx1="http://schemas.microsoft.com/office/drawing/2015/9/8/chartex" xmlns:cx2="http://schemas.microsoft.com/office/drawing/2015/10/21/chartex" xmlns:cx3="http://schemas.microsoft.com/office/drawing/2016/5/9/chartex" xmlns:cx4="http://schemas.microsoft.com/office/drawing/2016/5/10/chartex" xmlns:cx5="http://schemas.microsoft.com/office/drawing/2016/5/11/chartex" xmlns:cx6="http://schemas.microsoft.com/office/drawing/2016/5/12/chartex" xmlns:cx7="http://schemas.microsoft.com/office/drawing/2016/5/13/chartex" xmlns:cx8="http://schemas.microsoft.com/office/drawing/2016/5/14/chartex" xmlns:mc="http://schemas.openxmlformats.org/markup-compatibility/2006" xmlns:aink="http://schemas.microsoft.com/office/drawing/2016/ink" xmlns:am3d="http://schemas.microsoft.com/office/drawing/2017/model3d" xmlns:o="urn:schemas-microsoft-com:office:office" xmlns:oel="http://schemas.microsoft.com/office/2019/extlst" xmlns:r="http://schemas.openxmlformats.org/officeDocument/2006/relationships" xmlns:m="http://schemas.openxmlformats.org/officeDocument/2006/math" xmlns:v="urn:schemas-microsoft-com:vml" xmlns:wp14="http://schemas.microsoft.com/office/word/2010/wordprocessingDrawing" xmlns:wp="http://schemas.openxmlformats.org/drawingml/2006/wordprocessingDrawing" xmlns:w10="urn:schemas-microsoft-com:office:word" xmlns:w="http://schemas.openxmlformats.org/wordprocessingml/2006/main" xmlns:w14="http://schemas.microsoft.com/office/word/2010/wordml" xmlns:w15="http://schemas.microsoft.com/office/word/2012/wordml" xmlns:w16cex="http://schemas.microsoft.com/office/word/2018/wordml/cex" xmlns:w16cid="http://schemas.microsoft.com/office/word/2016/wordml/cid" xmlns:w16="http://schemas.microsoft.com/office/word/2018/wordml" xmlns:w16du="http://schemas.microsoft.com/office/word/2023/wordml/word16du" xmlns:w16sdtdh="http://schemas.microsoft.com/office/word/2020/wordml/sdtdatahash" xmlns:w16sdtfl="http://schemas.microsoft.com/office/word/2024/wordml/sdtformatlock" xmlns:w16se="http://schemas.microsoft.com/office/word/2015/wordml/symex" xmlns:wpg="http://schemas.microsoft.com/office/word/2010/wordprocessingGroup" xmlns:wpi="http://schemas.microsoft.com/office/word/2010/wordprocessingInk" xmlns:wne="http://schemas.microsoft.com/office/word/2006/wordml" xmlns:wps="http://schemas.microsoft.com/office/word/2010/wordprocessingShape" mc:Ignorable="w14 w15 w16se w16cid w16 w16cex w16sdtdh w16sdtfl w16du wp14">
+<w:endnotes xmlns:wpc="http://schemas.microsoft.com/office/word/2010/wordprocessingCanvas" xmlns:cx="http://schemas.microsoft.com/office/drawing/2014/chartex" xmlns:cx1="http://schemas.microsoft.com/office/drawing/2015/9/8/chartex" xmlns:cx2="http://schemas.microsoft.com/office/drawing/2015/10/21/chartex" xmlns:cx3="http://schemas.microsoft.com/office/drawing/2016/5/9/chartex" xmlns:cx4="http://schemas.microsoft.com/office/drawing/2016/5/10/chartex" xmlns:cx5="http://schemas.microsoft.com/office/drawing/2016/5/11/chartex" xmlns:cx6="http://schemas.microsoft.com/office/drawing/2016/5/12/chartex" xmlns:cx7="http://schemas.microsoft.com/office/drawing/2016/5/13/chartex" xmlns:cx8="http://schemas.microsoft.com/office/drawing/2016/5/14/chartex" xmlns:mc="http://schemas.openxmlformats.org/markup-compatibility/2006" xmlns:aink="http://schemas.microsoft.com/office/drawing/2016/ink" xmlns:am3d="http://schemas.microsoft.com/office/drawing/2017/model3d" xmlns:o="urn:schemas-microsoft-com:office:office" xmlns:oel="http://schemas.microsoft.com/office/2019/extlst" xmlns:r="http://schemas.openxmlformats.org/officeDocument/2006/relationships" xmlns:m="http://schemas.openxmlformats.org/officeDocument/2006/math" xmlns:v="urn:schemas-microsoft-com:vml" xmlns:wp14="http://schemas.microsoft.com/office/word/2010/wordprocessingDrawing" xmlns:wp="http://schemas.openxmlformats.org/drawingml/2006/wordprocessingDrawing" xmlns:w10="urn:schemas-microsoft-com:office:word" xmlns:w="http://schemas.openxmlformats.org/wordprocessingml/2006/main" xmlns:w14="http://schemas.microsoft.com/office/word/2010/wordml" xmlns:w15="http://schemas.microsoft.com/office/word/2012/wordml" xmlns:w16cex="http://schemas.microsoft.com/office/word/2018/wordml/cex" xmlns:w16cid="http://schemas.microsoft.com/office/word/2016/wordml/cid" xmlns:w16="http://schemas.microsoft.com/office/word/2018/wordml" xmlns:w16sdtdh="http://schemas.microsoft.com/office/word/2020/wordml/sdtdatahash" xmlns:w16se="http://schemas.microsoft.com/office/word/2015/wordml/symex" xmlns:wpg="http://schemas.microsoft.com/office/word/2010/wordprocessingGroup" xmlns:wpi="http://schemas.microsoft.com/office/word/2010/wordprocessingInk" xmlns:wne="http://schemas.microsoft.com/office/word/2006/wordml" xmlns:wps="http://schemas.microsoft.com/office/word/2010/wordprocessingShape" mc:Ignorable="w14 w15 w16se w16cid w16 w16cex w16sdtdh wp14">
   <w:endnote w:type="separator" w:id="-1">
     <w:p>
       <w:pPr>
@@ -816,7 +775,7 @@
 </file>
 
 <file path=word/footer1.xml><?xml version="1.0" encoding="utf-8"?>
-<w:ftr xmlns:wpc="http://schemas.microsoft.com/office/word/2010/wordprocessingCanvas" xmlns:cx="http://schemas.microsoft.com/office/drawing/2014/chartex" xmlns:cx1="http://schemas.microsoft.com/office/drawing/2015/9/8/chartex" xmlns:cx2="http://schemas.microsoft.com/office/drawing/2015/10/21/chartex" xmlns:cx3="http://schemas.microsoft.com/office/drawing/2016/5/9/chartex" xmlns:cx4="http://schemas.microsoft.com/office/drawing/2016/5/10/chartex" xmlns:cx5="http://schemas.microsoft.com/office/drawing/2016/5/11/chartex" xmlns:cx6="http://schemas.microsoft.com/office/drawing/2016/5/12/chartex" xmlns:cx7="http://schemas.microsoft.com/office/drawing/2016/5/13/chartex" xmlns:cx8="http://schemas.microsoft.com/office/drawing/2016/5/14/chartex" xmlns:mc="http://schemas.openxmlformats.org/markup-compatibility/2006" xmlns:aink="http://schemas.microsoft.com/office/drawing/2016/ink" xmlns:am3d="http://schemas.microsoft.com/office/drawing/2017/model3d" xmlns:o="urn:schemas-microsoft-com:office:office" xmlns:oel="http://schemas.microsoft.com/office/2019/extlst" xmlns:r="http://schemas.openxmlformats.org/officeDocument/2006/relationships" xmlns:m="http://schemas.openxmlformats.org/officeDocument/2006/math" xmlns:v="urn:schemas-microsoft-com:vml" xmlns:wp14="http://schemas.microsoft.com/office/word/2010/wordprocessingDrawing" xmlns:wp="http://schemas.openxmlformats.org/drawingml/2006/wordprocessingDrawing" xmlns:w10="urn:schemas-microsoft-com:office:word" xmlns:w="http://schemas.openxmlformats.org/wordprocessingml/2006/main" xmlns:w14="http://schemas.microsoft.com/office/word/2010/wordml" xmlns:w15="http://schemas.microsoft.com/office/word/2012/wordml" xmlns:w16cex="http://schemas.microsoft.com/office/word/2018/wordml/cex" xmlns:w16cid="http://schemas.microsoft.com/office/word/2016/wordml/cid" xmlns:w16="http://schemas.microsoft.com/office/word/2018/wordml" xmlns:w16du="http://schemas.microsoft.com/office/word/2023/wordml/word16du" xmlns:w16sdtdh="http://schemas.microsoft.com/office/word/2020/wordml/sdtdatahash" xmlns:w16sdtfl="http://schemas.microsoft.com/office/word/2024/wordml/sdtformatlock" xmlns:w16se="http://schemas.microsoft.com/office/word/2015/wordml/symex" xmlns:wpg="http://schemas.microsoft.com/office/word/2010/wordprocessingGroup" xmlns:wpi="http://schemas.microsoft.com/office/word/2010/wordprocessingInk" xmlns:wne="http://schemas.microsoft.com/office/word/2006/wordml" xmlns:wps="http://schemas.microsoft.com/office/word/2010/wordprocessingShape" mc:Ignorable="w14 w15 w16se w16cid w16 w16cex w16sdtdh w16sdtfl w16du wp14">
+<w:ftr xmlns:wpc="http://schemas.microsoft.com/office/word/2010/wordprocessingCanvas" xmlns:cx="http://schemas.microsoft.com/office/drawing/2014/chartex" xmlns:cx1="http://schemas.microsoft.com/office/drawing/2015/9/8/chartex" xmlns:cx2="http://schemas.microsoft.com/office/drawing/2015/10/21/chartex" xmlns:cx3="http://schemas.microsoft.com/office/drawing/2016/5/9/chartex" xmlns:cx4="http://schemas.microsoft.com/office/drawing/2016/5/10/chartex" xmlns:cx5="http://schemas.microsoft.com/office/drawing/2016/5/11/chartex" xmlns:cx6="http://schemas.microsoft.com/office/drawing/2016/5/12/chartex" xmlns:cx7="http://schemas.microsoft.com/office/drawing/2016/5/13/chartex" xmlns:cx8="http://schemas.microsoft.com/office/drawing/2016/5/14/chartex" xmlns:mc="http://schemas.openxmlformats.org/markup-compatibility/2006" xmlns:aink="http://schemas.microsoft.com/office/drawing/2016/ink" xmlns:am3d="http://schemas.microsoft.com/office/drawing/2017/model3d" xmlns:o="urn:schemas-microsoft-com:office:office" xmlns:oel="http://schemas.microsoft.com/office/2019/extlst" xmlns:r="http://schemas.openxmlformats.org/officeDocument/2006/relationships" xmlns:m="http://schemas.openxmlformats.org/officeDocument/2006/math" xmlns:v="urn:schemas-microsoft-com:vml" xmlns:wp14="http://schemas.microsoft.com/office/word/2010/wordprocessingDrawing" xmlns:wp="http://schemas.openxmlformats.org/drawingml/2006/wordprocessingDrawing" xmlns:w10="urn:schemas-microsoft-com:office:word" xmlns:w="http://schemas.openxmlformats.org/wordprocessingml/2006/main" xmlns:w14="http://schemas.microsoft.com/office/word/2010/wordml" xmlns:w15="http://schemas.microsoft.com/office/word/2012/wordml" xmlns:w16cex="http://schemas.microsoft.com/office/word/2018/wordml/cex" xmlns:w16cid="http://schemas.microsoft.com/office/word/2016/wordml/cid" xmlns:w16="http://schemas.microsoft.com/office/word/2018/wordml" xmlns:w16sdtdh="http://schemas.microsoft.com/office/word/2020/wordml/sdtdatahash" xmlns:w16se="http://schemas.microsoft.com/office/word/2015/wordml/symex" xmlns:wpg="http://schemas.microsoft.com/office/word/2010/wordprocessingGroup" xmlns:wpi="http://schemas.microsoft.com/office/word/2010/wordprocessingInk" xmlns:wne="http://schemas.microsoft.com/office/word/2006/wordml" xmlns:wps="http://schemas.microsoft.com/office/word/2010/wordprocessingShape" mc:Ignorable="w14 w15 w16se w16cid w16 w16cex w16sdtdh wp14">
   <w:p>
     <w:pPr>
       <w:pStyle w:val="Footer"/>
@@ -829,7 +788,7 @@
 </file>
 
 <file path=word/footnotes.xml><?xml version="1.0" encoding="utf-8"?>
-<w:footnotes xmlns:wpc="http://schemas.microsoft.com/office/word/2010/wordprocessingCanvas" xmlns:cx="http://schemas.microsoft.com/office/drawing/2014/chartex" xmlns:cx1="http://schemas.microsoft.com/office/drawing/2015/9/8/chartex" xmlns:cx2="http://schemas.microsoft.com/office/drawing/2015/10/21/chartex" xmlns:cx3="http://schemas.microsoft.com/office/drawing/2016/5/9/chartex" xmlns:cx4="http://schemas.microsoft.com/office/drawing/2016/5/10/chartex" xmlns:cx5="http://schemas.microsoft.com/office/drawing/2016/5/11/chartex" xmlns:cx6="http://schemas.microsoft.com/office/drawing/2016/5/12/chartex" xmlns:cx7="http://schemas.microsoft.com/office/drawing/2016/5/13/chartex" xmlns:cx8="http://schemas.microsoft.com/office/drawing/2016/5/14/chartex" xmlns:mc="http://schemas.openxmlformats.org/markup-compatibility/2006" xmlns:aink="http://schemas.microsoft.com/office/drawing/2016/ink" xmlns:am3d="http://schemas.microsoft.com/office/drawing/2017/model3d" xmlns:o="urn:schemas-microsoft-com:office:office" xmlns:oel="http://schemas.microsoft.com/office/2019/extlst" xmlns:r="http://schemas.openxmlformats.org/officeDocument/2006/relationships" xmlns:m="http://schemas.openxmlformats.org/officeDocument/2006/math" xmlns:v="urn:schemas-microsoft-com:vml" xmlns:wp14="http://schemas.microsoft.com/office/word/2010/wordprocessingDrawing" xmlns:wp="http://schemas.openxmlformats.org/drawingml/2006/wordprocessingDrawing" xmlns:w10="urn:schemas-microsoft-com:office:word" xmlns:w="http://schemas.openxmlformats.org/wordprocessingml/2006/main" xmlns:w14="http://schemas.microsoft.com/office/word/2010/wordml" xmlns:w15="http://schemas.microsoft.com/office/word/2012/wordml" xmlns:w16cex="http://schemas.microsoft.com/office/word/2018/wordml/cex" xmlns:w16cid="http://schemas.microsoft.com/office/word/2016/wordml/cid" xmlns:w16="http://schemas.microsoft.com/office/word/2018/wordml" xmlns:w16du="http://schemas.microsoft.com/office/word/2023/wordml/word16du" xmlns:w16sdtdh="http://schemas.microsoft.com/office/word/2020/wordml/sdtdatahash" xmlns:w16sdtfl="http://schemas.microsoft.com/office/word/2024/wordml/sdtformatlock" xmlns:w16se="http://schemas.microsoft.com/office/word/2015/wordml/symex" xmlns:wpg="http://schemas.microsoft.com/office/word/2010/wordprocessingGroup" xmlns:wpi="http://schemas.microsoft.com/office/word/2010/wordprocessingInk" xmlns:wne="http://schemas.microsoft.com/office/word/2006/wordml" xmlns:wps="http://schemas.microsoft.com/office/word/2010/wordprocessingShape" mc:Ignorable="w14 w15 w16se w16cid w16 w16cex w16sdtdh w16sdtfl w16du wp14">
+<w:footnotes xmlns:wpc="http://schemas.microsoft.com/office/word/2010/wordprocessingCanvas" xmlns:cx="http://schemas.microsoft.com/office/drawing/2014/chartex" xmlns:cx1="http://schemas.microsoft.com/office/drawing/2015/9/8/chartex" xmlns:cx2="http://schemas.microsoft.com/office/drawing/2015/10/21/chartex" xmlns:cx3="http://schemas.microsoft.com/office/drawing/2016/5/9/chartex" xmlns:cx4="http://schemas.microsoft.com/office/drawing/2016/5/10/chartex" xmlns:cx5="http://schemas.microsoft.com/office/drawing/2016/5/11/chartex" xmlns:cx6="http://schemas.microsoft.com/office/drawing/2016/5/12/chartex" xmlns:cx7="http://schemas.microsoft.com/office/drawing/2016/5/13/chartex" xmlns:cx8="http://schemas.microsoft.com/office/drawing/2016/5/14/chartex" xmlns:mc="http://schemas.openxmlformats.org/markup-compatibility/2006" xmlns:aink="http://schemas.microsoft.com/office/drawing/2016/ink" xmlns:am3d="http://schemas.microsoft.com/office/drawing/2017/model3d" xmlns:o="urn:schemas-microsoft-com:office:office" xmlns:oel="http://schemas.microsoft.com/office/2019/extlst" xmlns:r="http://schemas.openxmlformats.org/officeDocument/2006/relationships" xmlns:m="http://schemas.openxmlformats.org/officeDocument/2006/math" xmlns:v="urn:schemas-microsoft-com:vml" xmlns:wp14="http://schemas.microsoft.com/office/word/2010/wordprocessingDrawing" xmlns:wp="http://schemas.openxmlformats.org/drawingml/2006/wordprocessingDrawing" xmlns:w10="urn:schemas-microsoft-com:office:word" xmlns:w="http://schemas.openxmlformats.org/wordprocessingml/2006/main" xmlns:w14="http://schemas.microsoft.com/office/word/2010/wordml" xmlns:w15="http://schemas.microsoft.com/office/word/2012/wordml" xmlns:w16cex="http://schemas.microsoft.com/office/word/2018/wordml/cex" xmlns:w16cid="http://schemas.microsoft.com/office/word/2016/wordml/cid" xmlns:w16="http://schemas.microsoft.com/office/word/2018/wordml" xmlns:w16sdtdh="http://schemas.microsoft.com/office/word/2020/wordml/sdtdatahash" xmlns:w16se="http://schemas.microsoft.com/office/word/2015/wordml/symex" xmlns:wpg="http://schemas.microsoft.com/office/word/2010/wordprocessingGroup" xmlns:wpi="http://schemas.microsoft.com/office/word/2010/wordprocessingInk" xmlns:wne="http://schemas.microsoft.com/office/word/2006/wordml" xmlns:wps="http://schemas.microsoft.com/office/word/2010/wordprocessingShape" mc:Ignorable="w14 w15 w16se w16cid w16 w16cex w16sdtdh wp14">
   <w:footnote w:type="separator" w:id="-1">
     <w:p>
       <w:pPr>
@@ -854,7 +813,7 @@
 </file>
 
 <file path=word/header1.xml><?xml version="1.0" encoding="utf-8"?>
-<w:hdr xmlns:wpc="http://schemas.microsoft.com/office/word/2010/wordprocessingCanvas" xmlns:cx="http://schemas.microsoft.com/office/drawing/2014/chartex" xmlns:cx1="http://schemas.microsoft.com/office/drawing/2015/9/8/chartex" xmlns:cx2="http://schemas.microsoft.com/office/drawing/2015/10/21/chartex" xmlns:cx3="http://schemas.microsoft.com/office/drawing/2016/5/9/chartex" xmlns:cx4="http://schemas.microsoft.com/office/drawing/2016/5/10/chartex" xmlns:cx5="http://schemas.microsoft.com/office/drawing/2016/5/11/chartex" xmlns:cx6="http://schemas.microsoft.com/office/drawing/2016/5/12/chartex" xmlns:cx7="http://schemas.microsoft.com/office/drawing/2016/5/13/chartex" xmlns:cx8="http://schemas.microsoft.com/office/drawing/2016/5/14/chartex" xmlns:mc="http://schemas.openxmlformats.org/markup-compatibility/2006" xmlns:aink="http://schemas.microsoft.com/office/drawing/2016/ink" xmlns:am3d="http://schemas.microsoft.com/office/drawing/2017/model3d" xmlns:o="urn:schemas-microsoft-com:office:office" xmlns:oel="http://schemas.microsoft.com/office/2019/extlst" xmlns:r="http://schemas.openxmlformats.org/officeDocument/2006/relationships" xmlns:m="http://schemas.openxmlformats.org/officeDocument/2006/math" xmlns:v="urn:schemas-microsoft-com:vml" xmlns:wp14="http://schemas.microsoft.com/office/word/2010/wordprocessingDrawing" xmlns:wp="http://schemas.openxmlformats.org/drawingml/2006/wordprocessingDrawing" xmlns:w10="urn:schemas-microsoft-com:office:word" xmlns:w="http://schemas.openxmlformats.org/wordprocessingml/2006/main" xmlns:w14="http://schemas.microsoft.com/office/word/2010/wordml" xmlns:w15="http://schemas.microsoft.com/office/word/2012/wordml" xmlns:w16cex="http://schemas.microsoft.com/office/word/2018/wordml/cex" xmlns:w16cid="http://schemas.microsoft.com/office/word/2016/wordml/cid" xmlns:w16="http://schemas.microsoft.com/office/word/2018/wordml" xmlns:w16du="http://schemas.microsoft.com/office/word/2023/wordml/word16du" xmlns:w16sdtdh="http://schemas.microsoft.com/office/word/2020/wordml/sdtdatahash" xmlns:w16sdtfl="http://schemas.microsoft.com/office/word/2024/wordml/sdtformatlock" xmlns:w16se="http://schemas.microsoft.com/office/word/2015/wordml/symex" xmlns:wpg="http://schemas.microsoft.com/office/word/2010/wordprocessingGroup" xmlns:wpi="http://schemas.microsoft.com/office/word/2010/wordprocessingInk" xmlns:wne="http://schemas.microsoft.com/office/word/2006/wordml" xmlns:wps="http://schemas.microsoft.com/office/word/2010/wordprocessingShape" mc:Ignorable="w14 w15 w16se w16cid w16 w16cex w16sdtdh w16sdtfl w16du wp14">
+<w:hdr xmlns:wpc="http://schemas.microsoft.com/office/word/2010/wordprocessingCanvas" xmlns:cx="http://schemas.microsoft.com/office/drawing/2014/chartex" xmlns:cx1="http://schemas.microsoft.com/office/drawing/2015/9/8/chartex" xmlns:cx2="http://schemas.microsoft.com/office/drawing/2015/10/21/chartex" xmlns:cx3="http://schemas.microsoft.com/office/drawing/2016/5/9/chartex" xmlns:cx4="http://schemas.microsoft.com/office/drawing/2016/5/10/chartex" xmlns:cx5="http://schemas.microsoft.com/office/drawing/2016/5/11/chartex" xmlns:cx6="http://schemas.microsoft.com/office/drawing/2016/5/12/chartex" xmlns:cx7="http://schemas.microsoft.com/office/drawing/2016/5/13/chartex" xmlns:cx8="http://schemas.microsoft.com/office/drawing/2016/5/14/chartex" xmlns:mc="http://schemas.openxmlformats.org/markup-compatibility/2006" xmlns:aink="http://schemas.microsoft.com/office/drawing/2016/ink" xmlns:am3d="http://schemas.microsoft.com/office/drawing/2017/model3d" xmlns:o="urn:schemas-microsoft-com:office:office" xmlns:oel="http://schemas.microsoft.com/office/2019/extlst" xmlns:r="http://schemas.openxmlformats.org/officeDocument/2006/relationships" xmlns:m="http://schemas.openxmlformats.org/officeDocument/2006/math" xmlns:v="urn:schemas-microsoft-com:vml" xmlns:wp14="http://schemas.microsoft.com/office/word/2010/wordprocessingDrawing" xmlns:wp="http://schemas.openxmlformats.org/drawingml/2006/wordprocessingDrawing" xmlns:w10="urn:schemas-microsoft-com:office:word" xmlns:w="http://schemas.openxmlformats.org/wordprocessingml/2006/main" xmlns:w14="http://schemas.microsoft.com/office/word/2010/wordml" xmlns:w15="http://schemas.microsoft.com/office/word/2012/wordml" xmlns:w16cex="http://schemas.microsoft.com/office/word/2018/wordml/cex" xmlns:w16cid="http://schemas.microsoft.com/office/word/2016/wordml/cid" xmlns:w16="http://schemas.microsoft.com/office/word/2018/wordml" xmlns:w16sdtdh="http://schemas.microsoft.com/office/word/2020/wordml/sdtdatahash" xmlns:w16se="http://schemas.microsoft.com/office/word/2015/wordml/symex" xmlns:wpg="http://schemas.microsoft.com/office/word/2010/wordprocessingGroup" xmlns:wpi="http://schemas.microsoft.com/office/word/2010/wordprocessingInk" xmlns:wne="http://schemas.microsoft.com/office/word/2006/wordml" xmlns:wps="http://schemas.microsoft.com/office/word/2010/wordprocessingShape" mc:Ignorable="w14 w15 w16se w16cid w16 w16cex w16sdtdh wp14">
   <w:p>
     <w:pPr>
       <w:pStyle w:val="Header"/>
@@ -867,7 +826,7 @@
 </file>
 
 <file path=word/numbering.xml><?xml version="1.0" encoding="utf-8"?>
-<w:numbering xmlns:wpc="http://schemas.microsoft.com/office/word/2010/wordprocessingCanvas" xmlns:cx="http://schemas.microsoft.com/office/drawing/2014/chartex" xmlns:cx1="http://schemas.microsoft.com/office/drawing/2015/9/8/chartex" xmlns:cx2="http://schemas.microsoft.com/office/drawing/2015/10/21/chartex" xmlns:cx3="http://schemas.microsoft.com/office/drawing/2016/5/9/chartex" xmlns:cx4="http://schemas.microsoft.com/office/drawing/2016/5/10/chartex" xmlns:cx5="http://schemas.microsoft.com/office/drawing/2016/5/11/chartex" xmlns:cx6="http://schemas.microsoft.com/office/drawing/2016/5/12/chartex" xmlns:cx7="http://schemas.microsoft.com/office/drawing/2016/5/13/chartex" xmlns:cx8="http://schemas.microsoft.com/office/drawing/2016/5/14/chartex" xmlns:mc="http://schemas.openxmlformats.org/markup-compatibility/2006" xmlns:aink="http://schemas.microsoft.com/office/drawing/2016/ink" xmlns:am3d="http://schemas.microsoft.com/office/drawing/2017/model3d" xmlns:o="urn:schemas-microsoft-com:office:office" xmlns:oel="http://schemas.microsoft.com/office/2019/extlst" xmlns:r="http://schemas.openxmlformats.org/officeDocument/2006/relationships" xmlns:m="http://schemas.openxmlformats.org/officeDocument/2006/math" xmlns:v="urn:schemas-microsoft-com:vml" xmlns:wp14="http://schemas.microsoft.com/office/word/2010/wordprocessingDrawing" xmlns:wp="http://schemas.openxmlformats.org/drawingml/2006/wordprocessingDrawing" xmlns:w10="urn:schemas-microsoft-com:office:word" xmlns:w="http://schemas.openxmlformats.org/wordprocessingml/2006/main" xmlns:w14="http://schemas.microsoft.com/office/word/2010/wordml" xmlns:w15="http://schemas.microsoft.com/office/word/2012/wordml" xmlns:w16cex="http://schemas.microsoft.com/office/word/2018/wordml/cex" xmlns:w16cid="http://schemas.microsoft.com/office/word/2016/wordml/cid" xmlns:w16="http://schemas.microsoft.com/office/word/2018/wordml" xmlns:w16du="http://schemas.microsoft.com/office/word/2023/wordml/word16du" xmlns:w16sdtdh="http://schemas.microsoft.com/office/word/2020/wordml/sdtdatahash" xmlns:w16sdtfl="http://schemas.microsoft.com/office/word/2024/wordml/sdtformatlock" xmlns:w16se="http://schemas.microsoft.com/office/word/2015/wordml/symex" xmlns:wpg="http://schemas.microsoft.com/office/word/2010/wordprocessingGroup" xmlns:wpi="http://schemas.microsoft.com/office/word/2010/wordprocessingInk" xmlns:wne="http://schemas.microsoft.com/office/word/2006/wordml" xmlns:wps="http://schemas.microsoft.com/office/word/2010/wordprocessingShape" mc:Ignorable="w14 w15 w16se w16cid w16 w16cex w16sdtdh w16sdtfl w16du wp14">
+<w:numbering xmlns:wpc="http://schemas.microsoft.com/office/word/2010/wordprocessingCanvas" xmlns:cx="http://schemas.microsoft.com/office/drawing/2014/chartex" xmlns:cx1="http://schemas.microsoft.com/office/drawing/2015/9/8/chartex" xmlns:cx2="http://schemas.microsoft.com/office/drawing/2015/10/21/chartex" xmlns:cx3="http://schemas.microsoft.com/office/drawing/2016/5/9/chartex" xmlns:cx4="http://schemas.microsoft.com/office/drawing/2016/5/10/chartex" xmlns:cx5="http://schemas.microsoft.com/office/drawing/2016/5/11/chartex" xmlns:cx6="http://schemas.microsoft.com/office/drawing/2016/5/12/chartex" xmlns:cx7="http://schemas.microsoft.com/office/drawing/2016/5/13/chartex" xmlns:cx8="http://schemas.microsoft.com/office/drawing/2016/5/14/chartex" xmlns:mc="http://schemas.openxmlformats.org/markup-compatibility/2006" xmlns:aink="http://schemas.microsoft.com/office/drawing/2016/ink" xmlns:am3d="http://schemas.microsoft.com/office/drawing/2017/model3d" xmlns:o="urn:schemas-microsoft-com:office:office" xmlns:oel="http://schemas.microsoft.com/office/2019/extlst" xmlns:r="http://schemas.openxmlformats.org/officeDocument/2006/relationships" xmlns:m="http://schemas.openxmlformats.org/officeDocument/2006/math" xmlns:v="urn:schemas-microsoft-com:vml" xmlns:wp14="http://schemas.microsoft.com/office/word/2010/wordprocessingDrawing" xmlns:wp="http://schemas.openxmlformats.org/drawingml/2006/wordprocessingDrawing" xmlns:w10="urn:schemas-microsoft-com:office:word" xmlns:w="http://schemas.openxmlformats.org/wordprocessingml/2006/main" xmlns:w14="http://schemas.microsoft.com/office/word/2010/wordml" xmlns:w15="http://schemas.microsoft.com/office/word/2012/wordml" xmlns:w16cex="http://schemas.microsoft.com/office/word/2018/wordml/cex" xmlns:w16cid="http://schemas.microsoft.com/office/word/2016/wordml/cid" xmlns:w16="http://schemas.microsoft.com/office/word/2018/wordml" xmlns:w16sdtdh="http://schemas.microsoft.com/office/word/2020/wordml/sdtdatahash" xmlns:w16se="http://schemas.microsoft.com/office/word/2015/wordml/symex" xmlns:wpg="http://schemas.microsoft.com/office/word/2010/wordprocessingGroup" xmlns:wpi="http://schemas.microsoft.com/office/word/2010/wordprocessingInk" xmlns:wne="http://schemas.microsoft.com/office/word/2006/wordml" xmlns:wps="http://schemas.microsoft.com/office/word/2010/wordprocessingShape" mc:Ignorable="w14 w15 w16se w16cid w16 w16cex w16sdtdh wp14">
   <w:abstractNum w:abstractNumId="0" w15:restartNumberingAfterBreak="0">
     <w:nsid w:val="2034206F"/>
     <w:multiLevelType w:val="multilevel"/>
@@ -1121,7 +1080,7 @@
 </file>
 
 <file path=word/styles.xml><?xml version="1.0" encoding="utf-8"?>
-<w:styles xmlns:mc="http://schemas.openxmlformats.org/markup-compatibility/2006" xmlns:r="http://schemas.openxmlformats.org/officeDocument/2006/relationships" xmlns:w="http://schemas.openxmlformats.org/wordprocessingml/2006/main" xmlns:w14="http://schemas.microsoft.com/office/word/2010/wordml" xmlns:w15="http://schemas.microsoft.com/office/word/2012/wordml" xmlns:w16cex="http://schemas.microsoft.com/office/word/2018/wordml/cex" xmlns:w16cid="http://schemas.microsoft.com/office/word/2016/wordml/cid" xmlns:w16="http://schemas.microsoft.com/office/word/2018/wordml" xmlns:w16du="http://schemas.microsoft.com/office/word/2023/wordml/word16du" xmlns:w16sdtdh="http://schemas.microsoft.com/office/word/2020/wordml/sdtdatahash" xmlns:w16sdtfl="http://schemas.microsoft.com/office/word/2024/wordml/sdtformatlock" xmlns:w16se="http://schemas.microsoft.com/office/word/2015/wordml/symex" mc:Ignorable="w14 w15 w16se w16cid w16 w16cex w16sdtdh w16sdtfl w16du">
+<w:styles xmlns:mc="http://schemas.openxmlformats.org/markup-compatibility/2006" xmlns:r="http://schemas.openxmlformats.org/officeDocument/2006/relationships" xmlns:w="http://schemas.openxmlformats.org/wordprocessingml/2006/main" xmlns:w14="http://schemas.microsoft.com/office/word/2010/wordml" xmlns:w15="http://schemas.microsoft.com/office/word/2012/wordml" xmlns:w16cex="http://schemas.microsoft.com/office/word/2018/wordml/cex" xmlns:w16cid="http://schemas.microsoft.com/office/word/2016/wordml/cid" xmlns:w16="http://schemas.microsoft.com/office/word/2018/wordml" xmlns:w16sdtdh="http://schemas.microsoft.com/office/word/2020/wordml/sdtdatahash" xmlns:w16se="http://schemas.microsoft.com/office/word/2015/wordml/symex" mc:Ignorable="w14 w15 w16se w16cid w16 w16cex w16sdtdh">
   <w:docDefaults>
     <w:rPrDefault>
       <w:rPr>
@@ -1784,9 +1743,7 @@
   <w:style w:type="character" w:default="1" w:styleId="DefaultParagraphFont">
     <w:name w:val="Default Paragraph Font"/>
     <w:uiPriority w:val="1"/>
-    <w:semiHidden/>
     <w:unhideWhenUsed/>
-    <w:rsid w:val="00EB3367"/>
   </w:style>
   <w:style w:type="table" w:default="1" w:styleId="TableNormal">
     <w:name w:val="Normal Table"/>
@@ -1808,7 +1765,6 @@
     <w:uiPriority w:val="99"/>
     <w:semiHidden/>
     <w:unhideWhenUsed/>
-    <w:rsid w:val="00EB3367"/>
   </w:style>
   <w:style w:type="paragraph" w:styleId="Title">
     <w:name w:val="Title"/>
@@ -2340,7 +2296,7 @@
 </file>
 
 <file path=word/glossary/document.xml><?xml version="1.0" encoding="utf-8"?>
-<w:glossaryDocument xmlns:wpc="http://schemas.microsoft.com/office/word/2010/wordprocessingCanvas" xmlns:cx="http://schemas.microsoft.com/office/drawing/2014/chartex" xmlns:cx1="http://schemas.microsoft.com/office/drawing/2015/9/8/chartex" xmlns:cx2="http://schemas.microsoft.com/office/drawing/2015/10/21/chartex" xmlns:cx3="http://schemas.microsoft.com/office/drawing/2016/5/9/chartex" xmlns:cx4="http://schemas.microsoft.com/office/drawing/2016/5/10/chartex" xmlns:cx5="http://schemas.microsoft.com/office/drawing/2016/5/11/chartex" xmlns:cx6="http://schemas.microsoft.com/office/drawing/2016/5/12/chartex" xmlns:cx7="http://schemas.microsoft.com/office/drawing/2016/5/13/chartex" xmlns:cx8="http://schemas.microsoft.com/office/drawing/2016/5/14/chartex" xmlns:mc="http://schemas.openxmlformats.org/markup-compatibility/2006" xmlns:aink="http://schemas.microsoft.com/office/drawing/2016/ink" xmlns:am3d="http://schemas.microsoft.com/office/drawing/2017/model3d" xmlns:o="urn:schemas-microsoft-com:office:office" xmlns:oel="http://schemas.microsoft.com/office/2019/extlst" xmlns:r="http://schemas.openxmlformats.org/officeDocument/2006/relationships" xmlns:m="http://schemas.openxmlformats.org/officeDocument/2006/math" xmlns:v="urn:schemas-microsoft-com:vml" xmlns:wp14="http://schemas.microsoft.com/office/word/2010/wordprocessingDrawing" xmlns:wp="http://schemas.openxmlformats.org/drawingml/2006/wordprocessingDrawing" xmlns:w10="urn:schemas-microsoft-com:office:word" xmlns:w="http://schemas.openxmlformats.org/wordprocessingml/2006/main" xmlns:w14="http://schemas.microsoft.com/office/word/2010/wordml" xmlns:w15="http://schemas.microsoft.com/office/word/2012/wordml" xmlns:w16cex="http://schemas.microsoft.com/office/word/2018/wordml/cex" xmlns:w16cid="http://schemas.microsoft.com/office/word/2016/wordml/cid" xmlns:w16="http://schemas.microsoft.com/office/word/2018/wordml" xmlns:w16du="http://schemas.microsoft.com/office/word/2023/wordml/word16du" xmlns:w16sdtdh="http://schemas.microsoft.com/office/word/2020/wordml/sdtdatahash" xmlns:w16sdtfl="http://schemas.microsoft.com/office/word/2024/wordml/sdtformatlock" xmlns:w16se="http://schemas.microsoft.com/office/word/2015/wordml/symex" xmlns:wpg="http://schemas.microsoft.com/office/word/2010/wordprocessingGroup" xmlns:wpi="http://schemas.microsoft.com/office/word/2010/wordprocessingInk" xmlns:wne="http://schemas.microsoft.com/office/word/2006/wordml" xmlns:wps="http://schemas.microsoft.com/office/word/2010/wordprocessingShape" mc:Ignorable="w14 w15 w16se w16cid w16 w16cex w16sdtdh w16sdtfl w16du wp14">
+<w:glossaryDocument xmlns:wpc="http://schemas.microsoft.com/office/word/2010/wordprocessingCanvas" xmlns:cx="http://schemas.microsoft.com/office/drawing/2014/chartex" xmlns:cx1="http://schemas.microsoft.com/office/drawing/2015/9/8/chartex" xmlns:cx2="http://schemas.microsoft.com/office/drawing/2015/10/21/chartex" xmlns:cx3="http://schemas.microsoft.com/office/drawing/2016/5/9/chartex" xmlns:cx4="http://schemas.microsoft.com/office/drawing/2016/5/10/chartex" xmlns:cx5="http://schemas.microsoft.com/office/drawing/2016/5/11/chartex" xmlns:cx6="http://schemas.microsoft.com/office/drawing/2016/5/12/chartex" xmlns:cx7="http://schemas.microsoft.com/office/drawing/2016/5/13/chartex" xmlns:cx8="http://schemas.microsoft.com/office/drawing/2016/5/14/chartex" xmlns:mc="http://schemas.openxmlformats.org/markup-compatibility/2006" xmlns:aink="http://schemas.microsoft.com/office/drawing/2016/ink" xmlns:am3d="http://schemas.microsoft.com/office/drawing/2017/model3d" xmlns:o="urn:schemas-microsoft-com:office:office" xmlns:oel="http://schemas.microsoft.com/office/2019/extlst" xmlns:r="http://schemas.openxmlformats.org/officeDocument/2006/relationships" xmlns:m="http://schemas.openxmlformats.org/officeDocument/2006/math" xmlns:v="urn:schemas-microsoft-com:vml" xmlns:wp14="http://schemas.microsoft.com/office/word/2010/wordprocessingDrawing" xmlns:wp="http://schemas.openxmlformats.org/drawingml/2006/wordprocessingDrawing" xmlns:w10="urn:schemas-microsoft-com:office:word" xmlns:w="http://schemas.openxmlformats.org/wordprocessingml/2006/main" xmlns:w14="http://schemas.microsoft.com/office/word/2010/wordml" xmlns:w15="http://schemas.microsoft.com/office/word/2012/wordml" xmlns:w16cex="http://schemas.microsoft.com/office/word/2018/wordml/cex" xmlns:w16cid="http://schemas.microsoft.com/office/word/2016/wordml/cid" xmlns:w16="http://schemas.microsoft.com/office/word/2018/wordml" xmlns:w16sdtdh="http://schemas.microsoft.com/office/word/2020/wordml/sdtdatahash" xmlns:w16se="http://schemas.microsoft.com/office/word/2015/wordml/symex" xmlns:wpg="http://schemas.microsoft.com/office/word/2010/wordprocessingGroup" xmlns:wpi="http://schemas.microsoft.com/office/word/2010/wordprocessingInk" xmlns:wne="http://schemas.microsoft.com/office/word/2006/wordml" xmlns:wps="http://schemas.microsoft.com/office/word/2010/wordprocessingShape" mc:Ignorable="w14 w15 w16se w16cid w16 w16cex w16sdtdh wp14">
   <w:docParts>
     <w:docPart>
       <w:docPartPr>
@@ -2526,32 +2482,6 @@
     </w:docPart>
     <w:docPart>
       <w:docPartPr>
-        <w:name w:val="7C427412CF1D4B40B38824F7B7FF974F"/>
-        <w:category>
-          <w:name w:val="General"/>
-          <w:gallery w:val="placeholder"/>
-        </w:category>
-        <w:types>
-          <w:type w:val="bbPlcHdr"/>
-        </w:types>
-        <w:behaviors>
-          <w:behavior w:val="content"/>
-        </w:behaviors>
-        <w:guid w:val="{69AD6790-1EED-408E-B495-6E144556E41B}"/>
-      </w:docPartPr>
-      <w:docPartBody>
-        <w:p>
-          <w:r>
-            <w:rPr>
-              <w:rStyle w:val="PlaceholderText"/>
-            </w:rPr>
-            <w:t xml:space="preserve"> </w:t>
-          </w:r>
-        </w:p>
-      </w:docPartBody>
-    </w:docPart>
-    <w:docPart>
-      <w:docPartPr>
         <w:name w:val="3D4DC6A50309446F9D5EAD0AEDB70D0B"/>
         <w:category>
           <w:name w:val="General"/>
@@ -2564,58 +2494,6 @@
           <w:behavior w:val="content"/>
         </w:behaviors>
         <w:guid w:val="{8DC1A0F9-3C5D-4E24-89EF-04916434A1C6}"/>
-      </w:docPartPr>
-      <w:docPartBody>
-        <w:p>
-          <w:r>
-            <w:rPr>
-              <w:rStyle w:val="PlaceholderText"/>
-            </w:rPr>
-            <w:t xml:space="preserve"> </w:t>
-          </w:r>
-        </w:p>
-      </w:docPartBody>
-    </w:docPart>
-    <w:docPart>
-      <w:docPartPr>
-        <w:name w:val="FE96C38C8EB343C0A906879C8CCB60A2"/>
-        <w:category>
-          <w:name w:val="General"/>
-          <w:gallery w:val="placeholder"/>
-        </w:category>
-        <w:types>
-          <w:type w:val="bbPlcHdr"/>
-        </w:types>
-        <w:behaviors>
-          <w:behavior w:val="content"/>
-        </w:behaviors>
-        <w:guid w:val="{E14F8191-2D41-4ACF-BA8E-357C6D2BA749}"/>
-      </w:docPartPr>
-      <w:docPartBody>
-        <w:p>
-          <w:r>
-            <w:rPr>
-              <w:rStyle w:val="PlaceholderText"/>
-            </w:rPr>
-            <w:t xml:space="preserve"> </w:t>
-          </w:r>
-        </w:p>
-      </w:docPartBody>
-    </w:docPart>
-    <w:docPart>
-      <w:docPartPr>
-        <w:name w:val="61193DEEE1BB44B4A824310CB43CC09A"/>
-        <w:category>
-          <w:name w:val="General"/>
-          <w:gallery w:val="placeholder"/>
-        </w:category>
-        <w:types>
-          <w:type w:val="bbPlcHdr"/>
-        </w:types>
-        <w:behaviors>
-          <w:behavior w:val="content"/>
-        </w:behaviors>
-        <w:guid w:val="{CBBF7055-F1C0-4164-B11A-F33936C72A6F}"/>
       </w:docPartPr>
       <w:docPartBody>
         <w:p>
@@ -2711,7 +2589,7 @@
 </file>
 
 <file path=word/glossary/fontTable.xml><?xml version="1.0" encoding="utf-8"?>
-<w:fonts xmlns:mc="http://schemas.openxmlformats.org/markup-compatibility/2006" xmlns:r="http://schemas.openxmlformats.org/officeDocument/2006/relationships" xmlns:w="http://schemas.openxmlformats.org/wordprocessingml/2006/main" xmlns:w14="http://schemas.microsoft.com/office/word/2010/wordml" xmlns:w15="http://schemas.microsoft.com/office/word/2012/wordml" xmlns:w16cex="http://schemas.microsoft.com/office/word/2018/wordml/cex" xmlns:w16cid="http://schemas.microsoft.com/office/word/2016/wordml/cid" xmlns:w16="http://schemas.microsoft.com/office/word/2018/wordml" xmlns:w16du="http://schemas.microsoft.com/office/word/2023/wordml/word16du" xmlns:w16sdtdh="http://schemas.microsoft.com/office/word/2020/wordml/sdtdatahash" xmlns:w16sdtfl="http://schemas.microsoft.com/office/word/2024/wordml/sdtformatlock" xmlns:w16se="http://schemas.microsoft.com/office/word/2015/wordml/symex" mc:Ignorable="w14 w15 w16se w16cid w16 w16cex w16sdtdh w16sdtfl w16du">
+<w:fonts xmlns:mc="http://schemas.openxmlformats.org/markup-compatibility/2006" xmlns:r="http://schemas.openxmlformats.org/officeDocument/2006/relationships" xmlns:w="http://schemas.openxmlformats.org/wordprocessingml/2006/main" xmlns:w14="http://schemas.microsoft.com/office/word/2010/wordml" xmlns:w15="http://schemas.microsoft.com/office/word/2012/wordml" xmlns:w16cex="http://schemas.microsoft.com/office/word/2018/wordml/cex" xmlns:w16cid="http://schemas.microsoft.com/office/word/2016/wordml/cid" xmlns:w16="http://schemas.microsoft.com/office/word/2018/wordml" xmlns:w16sdtdh="http://schemas.microsoft.com/office/word/2020/wordml/sdtdatahash" xmlns:w16se="http://schemas.microsoft.com/office/word/2015/wordml/symex" mc:Ignorable="w14 w15 w16se w16cid w16 w16cex w16sdtdh">
   <w:font w:name="B Nazanin">
     <w:panose1 w:val="00000400000000000000"/>
     <w:charset w:val="B2"/>
@@ -2754,11 +2632,23 @@
     <w:pitch w:val="variable"/>
     <w:sig w:usb0="E0002EFF" w:usb1="C000785B" w:usb2="00000009" w:usb3="00000000" w:csb0="000001FF" w:csb1="00000000"/>
   </w:font>
+  <w:font w:name="Aptos">
+    <w:charset w:val="00"/>
+    <w:family w:val="swiss"/>
+    <w:pitch w:val="variable"/>
+    <w:sig w:usb0="20000287" w:usb1="00000003" w:usb2="00000000" w:usb3="00000000" w:csb0="0000019F" w:csb1="00000000"/>
+  </w:font>
+  <w:font w:name="Aptos Display">
+    <w:charset w:val="00"/>
+    <w:family w:val="swiss"/>
+    <w:pitch w:val="variable"/>
+    <w:sig w:usb0="20000287" w:usb1="00000003" w:usb2="00000000" w:usb3="00000000" w:csb0="0000019F" w:csb1="00000000"/>
+  </w:font>
 </w:fonts>
 </file>
 
 <file path=word/glossary/settings.xml><?xml version="1.0" encoding="utf-8"?>
-<w:settings xmlns:mc="http://schemas.openxmlformats.org/markup-compatibility/2006" xmlns:o="urn:schemas-microsoft-com:office:office" xmlns:r="http://schemas.openxmlformats.org/officeDocument/2006/relationships" xmlns:m="http://schemas.openxmlformats.org/officeDocument/2006/math" xmlns:v="urn:schemas-microsoft-com:vml" xmlns:w10="urn:schemas-microsoft-com:office:word" xmlns:w="http://schemas.openxmlformats.org/wordprocessingml/2006/main" xmlns:w14="http://schemas.microsoft.com/office/word/2010/wordml" xmlns:w15="http://schemas.microsoft.com/office/word/2012/wordml" xmlns:w16cex="http://schemas.microsoft.com/office/word/2018/wordml/cex" xmlns:w16cid="http://schemas.microsoft.com/office/word/2016/wordml/cid" xmlns:w16="http://schemas.microsoft.com/office/word/2018/wordml" xmlns:w16du="http://schemas.microsoft.com/office/word/2023/wordml/word16du" xmlns:w16sdtdh="http://schemas.microsoft.com/office/word/2020/wordml/sdtdatahash" xmlns:w16sdtfl="http://schemas.microsoft.com/office/word/2024/wordml/sdtformatlock" xmlns:w16se="http://schemas.microsoft.com/office/word/2015/wordml/symex" xmlns:sl="http://schemas.openxmlformats.org/schemaLibrary/2006/main" mc:Ignorable="w14 w15 w16se w16cid w16 w16cex w16sdtdh w16sdtfl w16du">
+<w:settings xmlns:mc="http://schemas.openxmlformats.org/markup-compatibility/2006" xmlns:o="urn:schemas-microsoft-com:office:office" xmlns:r="http://schemas.openxmlformats.org/officeDocument/2006/relationships" xmlns:m="http://schemas.openxmlformats.org/officeDocument/2006/math" xmlns:v="urn:schemas-microsoft-com:vml" xmlns:w10="urn:schemas-microsoft-com:office:word" xmlns:w="http://schemas.openxmlformats.org/wordprocessingml/2006/main" xmlns:w14="http://schemas.microsoft.com/office/word/2010/wordml" xmlns:w15="http://schemas.microsoft.com/office/word/2012/wordml" xmlns:w16cex="http://schemas.microsoft.com/office/word/2018/wordml/cex" xmlns:w16cid="http://schemas.microsoft.com/office/word/2016/wordml/cid" xmlns:w16="http://schemas.microsoft.com/office/word/2018/wordml" xmlns:w16sdtdh="http://schemas.microsoft.com/office/word/2020/wordml/sdtdatahash" xmlns:w16se="http://schemas.microsoft.com/office/word/2015/wordml/symex" xmlns:sl="http://schemas.openxmlformats.org/schemaLibrary/2006/main" mc:Ignorable="w14 w15 w16se w16cid w16 w16cex w16sdtdh">
   <w:view w:val="normal"/>
   <w:defaultTabStop w:val="720"/>
   <w:characterSpacingControl w:val="doNotCompress"/>
@@ -2781,6 +2671,7 @@
     <w:rsid w:val="000B1874"/>
     <w:rsid w:val="000F4243"/>
     <w:rsid w:val="00173762"/>
+    <w:rsid w:val="001910A1"/>
     <w:rsid w:val="00195521"/>
     <w:rsid w:val="00196A93"/>
     <w:rsid w:val="001B4BE4"/>
@@ -2806,6 +2697,7 @@
     <w:rsid w:val="009F1432"/>
     <w:rsid w:val="00A05A1E"/>
     <w:rsid w:val="00A717F6"/>
+    <w:rsid w:val="00AA34B2"/>
     <w:rsid w:val="00AC65CA"/>
     <w:rsid w:val="00AF6158"/>
     <w:rsid w:val="00B06836"/>
@@ -2841,7 +2733,7 @@
 </file>
 
 <file path=word/glossary/styles.xml><?xml version="1.0" encoding="utf-8"?>
-<w:styles xmlns:mc="http://schemas.openxmlformats.org/markup-compatibility/2006" xmlns:r="http://schemas.openxmlformats.org/officeDocument/2006/relationships" xmlns:w="http://schemas.openxmlformats.org/wordprocessingml/2006/main" xmlns:w14="http://schemas.microsoft.com/office/word/2010/wordml" xmlns:w15="http://schemas.microsoft.com/office/word/2012/wordml" xmlns:w16cex="http://schemas.microsoft.com/office/word/2018/wordml/cex" xmlns:w16cid="http://schemas.microsoft.com/office/word/2016/wordml/cid" xmlns:w16="http://schemas.microsoft.com/office/word/2018/wordml" xmlns:w16du="http://schemas.microsoft.com/office/word/2023/wordml/word16du" xmlns:w16sdtdh="http://schemas.microsoft.com/office/word/2020/wordml/sdtdatahash" xmlns:w16sdtfl="http://schemas.microsoft.com/office/word/2024/wordml/sdtformatlock" xmlns:w16se="http://schemas.microsoft.com/office/word/2015/wordml/symex" mc:Ignorable="w14 w15 w16se w16cid w16 w16cex w16sdtdh w16sdtfl w16du">
+<w:styles xmlns:mc="http://schemas.openxmlformats.org/markup-compatibility/2006" xmlns:r="http://schemas.openxmlformats.org/officeDocument/2006/relationships" xmlns:w="http://schemas.openxmlformats.org/wordprocessingml/2006/main" xmlns:w14="http://schemas.microsoft.com/office/word/2010/wordml" xmlns:w15="http://schemas.microsoft.com/office/word/2012/wordml" xmlns:w16cex="http://schemas.microsoft.com/office/word/2018/wordml/cex" xmlns:w16cid="http://schemas.microsoft.com/office/word/2016/wordml/cid" xmlns:w16="http://schemas.microsoft.com/office/word/2018/wordml" xmlns:w16sdtdh="http://schemas.microsoft.com/office/word/2020/wordml/sdtdatahash" xmlns:w16se="http://schemas.microsoft.com/office/word/2015/wordml/symex" mc:Ignorable="w14 w15 w16se w16cid w16 w16cex w16sdtdh">
   <w:docDefaults>
     <w:rPrDefault>
       <w:rPr>
@@ -3282,7 +3174,7 @@
 </file>
 
 <file path=word/glossary/webSettings.xml><?xml version="1.0" encoding="utf-8"?>
-<w:webSettings xmlns:mc="http://schemas.openxmlformats.org/markup-compatibility/2006" xmlns:r="http://schemas.openxmlformats.org/officeDocument/2006/relationships" xmlns:w="http://schemas.openxmlformats.org/wordprocessingml/2006/main" xmlns:w14="http://schemas.microsoft.com/office/word/2010/wordml" xmlns:w15="http://schemas.microsoft.com/office/word/2012/wordml" xmlns:w16cex="http://schemas.microsoft.com/office/word/2018/wordml/cex" xmlns:w16cid="http://schemas.microsoft.com/office/word/2016/wordml/cid" xmlns:w16="http://schemas.microsoft.com/office/word/2018/wordml" xmlns:w16du="http://schemas.microsoft.com/office/word/2023/wordml/word16du" xmlns:w16sdtdh="http://schemas.microsoft.com/office/word/2020/wordml/sdtdatahash" xmlns:w16sdtfl="http://schemas.microsoft.com/office/word/2024/wordml/sdtformatlock" xmlns:w16se="http://schemas.microsoft.com/office/word/2015/wordml/symex" mc:Ignorable="w14 w15 w16se w16cid w16 w16cex w16sdtdh w16sdtfl w16du">
+<w:webSettings xmlns:mc="http://schemas.openxmlformats.org/markup-compatibility/2006" xmlns:r="http://schemas.openxmlformats.org/officeDocument/2006/relationships" xmlns:w="http://schemas.openxmlformats.org/wordprocessingml/2006/main" xmlns:w14="http://schemas.microsoft.com/office/word/2010/wordml" xmlns:w15="http://schemas.microsoft.com/office/word/2012/wordml" xmlns:w16cex="http://schemas.microsoft.com/office/word/2018/wordml/cex" xmlns:w16cid="http://schemas.microsoft.com/office/word/2016/wordml/cid" xmlns:w16="http://schemas.microsoft.com/office/word/2018/wordml" xmlns:w16sdtdh="http://schemas.microsoft.com/office/word/2020/wordml/sdtdatahash" xmlns:w16se="http://schemas.microsoft.com/office/word/2015/wordml/symex" mc:Ignorable="w14 w15 w16se w16cid w16 w16cex w16sdtdh">
   <w:optimizeForBrowser/>
   <w:allowPNG/>
 </w:webSettings>

</xml_diff>